<commit_message>
docs(modulo5): actualizar los tres documentos de entrega
- Manual: login/panel marcados como implementados, alcance en pasado,
  6 endpoints reales documentados, Express sirve frontend estático
- Diagrama BD: tipo_portador completo (niño, adulto mayor agregados),
  URL de perfil corregida a ?token=, POST /api/pulseras mencionado
- Esquema clases: modal + Nueva pulsera, POST /api/pulseras, conclusión
  en pasado reflejando implementación validada en dispositivos reales

Co-Authored-By: Claude Sonnet 4.6 <noreply@anthropic.com>
</commit_message>
<xml_diff>
--- a/Documentos Modulo 5/Diagrama_BD_SafeTagQR.docx
+++ b/Documentos Modulo 5/Diagrama_BD_SafeTagQR.docx
@@ -3151,7 +3151,7 @@
                 <w:szCs w:val="18"/>
                 <w:lang w:val="es-SV"/>
               </w:rPr>
-              <w:t>Tipo: 'persona', 'mascota' u 'objeto'</w:t>
+              <w:t>Tipo: 'persona', 'niño', 'adulto mayor', 'mascota' u 'objeto'</w:t>
             </w:r>
           </w:p>
         </w:tc>
@@ -6516,14 +6516,13 @@
           <w:color w:val="2E75B6"/>
           <w:lang w:val="es-SV"/>
         </w:rPr>
-        <w:t xml:space="preserve">— </w:t>
-      </w:r>
-      <w:r>
-        <w:rPr>
-          <w:rFonts w:ascii="Calibri" w:eastAsia="Calibri" w:hAnsi="Calibri" w:cs="Calibri"/>
-          <w:lang w:val="es-SV"/>
-        </w:rPr>
-        <w:t>El QR deja de apuntar a un archivo local. Apuntara a una URL publica: https://safetag.onrender.com/perfil/[TOKEN-UUID]. Cualquier dispositivo que escanee el QR accede al perfil.</w:t>
+        <w:t>— El QR deja de apuntar a un archivo local. Apuntara a una URL publica: http://[IP-local]:3001/perfil.html?token=[TOKEN-UUID]. Cualquier dispositivo que escanee el QR accede al perfil.</w:t>
+      </w:r>
+      <w:r>
+        <w:rPr>
+          <w:rFonts w:ascii="Calibri" w:eastAsia="Calibri" w:hAnsi="Calibri" w:cs="Calibri"/>
+          <w:lang w:val="es-SV"/>
+        </w:rPr>
       </w:r>
     </w:p>
     <w:p>
@@ -6702,14 +6701,13 @@
           <w:color w:val="2E75B6"/>
           <w:lang w:val="es-SV"/>
         </w:rPr>
-        <w:t xml:space="preserve">— </w:t>
-      </w:r>
-      <w:r>
-        <w:rPr>
-          <w:rFonts w:ascii="Calibri" w:eastAsia="Calibri" w:hAnsi="Calibri" w:cs="Calibri"/>
-          <w:lang w:val="es-SV"/>
-        </w:rPr>
-        <w:t xml:space="preserve">El </w:t>
+        <w:t>— El login y el panel se conectan a los endpoints POST /api/login y GET /api/mis-pulseras respectivamente. El panel también llama a POST /api/pulseras para crear pulseras adicionales sin registrar una cuenta nueva.</w:t>
+      </w:r>
+      <w:r>
+        <w:rPr>
+          <w:rFonts w:ascii="Calibri" w:eastAsia="Calibri" w:hAnsi="Calibri" w:cs="Calibri"/>
+          <w:lang w:val="es-SV"/>
+        </w:rPr>
       </w:r>
       <w:proofErr w:type="spellStart"/>
       <w:r>
@@ -6717,7 +6715,6 @@
           <w:rFonts w:ascii="Calibri" w:eastAsia="Calibri" w:hAnsi="Calibri" w:cs="Calibri"/>
           <w:lang w:val="es-SV"/>
         </w:rPr>
-        <w:t>login</w:t>
       </w:r>
       <w:proofErr w:type="spellEnd"/>
       <w:r>
@@ -6725,7 +6722,6 @@
           <w:rFonts w:ascii="Calibri" w:eastAsia="Calibri" w:hAnsi="Calibri" w:cs="Calibri"/>
           <w:lang w:val="es-SV"/>
         </w:rPr>
-        <w:t xml:space="preserve"> y el panel se conectan a los endpoints POST /api/</w:t>
       </w:r>
       <w:proofErr w:type="spellStart"/>
       <w:r>
@@ -6733,7 +6729,6 @@
           <w:rFonts w:ascii="Calibri" w:eastAsia="Calibri" w:hAnsi="Calibri" w:cs="Calibri"/>
           <w:lang w:val="es-SV"/>
         </w:rPr>
-        <w:t>login</w:t>
       </w:r>
       <w:proofErr w:type="spellEnd"/>
       <w:r>
@@ -6741,7 +6736,6 @@
           <w:rFonts w:ascii="Calibri" w:eastAsia="Calibri" w:hAnsi="Calibri" w:cs="Calibri"/>
           <w:lang w:val="es-SV"/>
         </w:rPr>
-        <w:t xml:space="preserve"> y GET /api/mis-pulseras respectivamente.</w:t>
       </w:r>
     </w:p>
     <w:p>

</xml_diff>

<commit_message>
docs: actualizar diagramas UML con tipos de portador completos y agregarPulsera()
- Diagrama de clases: tipoPortador ahora muestra persona|nino|adulto mayor|mascota|objeto;
  se agrega metodo agregarPulsera() a la clase Pulsera (refleja POST /api/pulseras)
- Diagrama BD: tipo_portador lista los cinco valores validos; arquitectura actualizada
  de GitHub Pages a Express static; flujo de panel incluye POST /api/pulseras

Co-Authored-By: Claude Sonnet 4.6 <noreply@anthropic.com>
</commit_message>
<xml_diff>
--- a/Documentos Modulo 5/Diagrama_BD_SafeTagQR.docx
+++ b/Documentos Modulo 5/Diagrama_BD_SafeTagQR.docx
@@ -6215,69 +6215,63 @@
                 <w:szCs w:val="18"/>
                 <w:lang w:val="es-SV"/>
               </w:rPr>
-              <w:t xml:space="preserve">HTML/CSS/JS del </w:t>
-            </w:r>
-            <w:r>
-              <w:rPr>
-                <w:rFonts w:ascii="Calibri" w:eastAsia="Calibri" w:hAnsi="Calibri" w:cs="Calibri"/>
-                <w:color w:val="000000"/>
-                <w:sz w:val="18"/>
-                <w:szCs w:val="18"/>
-                <w:lang w:val="es-SV"/>
-              </w:rPr>
-              <w:t>Módulo</w:t>
-            </w:r>
-            <w:r>
-              <w:rPr>
-                <w:rFonts w:ascii="Calibri" w:eastAsia="Calibri" w:hAnsi="Calibri" w:cs="Calibri"/>
-                <w:color w:val="000000"/>
-                <w:sz w:val="18"/>
-                <w:szCs w:val="18"/>
-                <w:lang w:val="es-SV"/>
-              </w:rPr>
-              <w:t xml:space="preserve"> 4 alojado en GitHub Pages. No cambia su estructura; </w:t>
-            </w:r>
-            <w:r>
-              <w:rPr>
-                <w:rFonts w:ascii="Calibri" w:eastAsia="Calibri" w:hAnsi="Calibri" w:cs="Calibri"/>
-                <w:color w:val="000000"/>
-                <w:sz w:val="18"/>
-                <w:szCs w:val="18"/>
-                <w:lang w:val="es-SV"/>
-              </w:rPr>
-              <w:t>únicamente</w:t>
-            </w:r>
-            <w:r>
-              <w:rPr>
-                <w:rFonts w:ascii="Calibri" w:eastAsia="Calibri" w:hAnsi="Calibri" w:cs="Calibri"/>
-                <w:color w:val="000000"/>
-                <w:sz w:val="18"/>
-                <w:szCs w:val="18"/>
-                <w:lang w:val="es-SV"/>
-              </w:rPr>
-              <w:t xml:space="preserve"> reemplaza llamadas a localStorage por llamadas </w:t>
-            </w:r>
-            <w:proofErr w:type="spellStart"/>
-            <w:r>
-              <w:rPr>
-                <w:rFonts w:ascii="Calibri" w:eastAsia="Calibri" w:hAnsi="Calibri" w:cs="Calibri"/>
-                <w:color w:val="000000"/>
-                <w:sz w:val="18"/>
-                <w:szCs w:val="18"/>
-                <w:lang w:val="es-SV"/>
-              </w:rPr>
-              <w:t>fetch</w:t>
-            </w:r>
-            <w:proofErr w:type="spellEnd"/>
-            <w:r>
-              <w:rPr>
-                <w:rFonts w:ascii="Calibri" w:eastAsia="Calibri" w:hAnsi="Calibri" w:cs="Calibri"/>
-                <w:color w:val="000000"/>
-                <w:sz w:val="18"/>
-                <w:szCs w:val="18"/>
-                <w:lang w:val="es-SV"/>
-              </w:rPr>
-              <w:t>() a la API.</w:t>
+              <w:t>HTML/CSS/JS servido directamente por Express desde el mismo servidor en el puerto 3001. Reemplaza llamadas a localStorage por llamadas fetch() a la API REST.</w:t>
+            </w:r>
+            <w:r>
+              <w:rPr>
+                <w:rFonts w:ascii="Calibri" w:eastAsia="Calibri" w:hAnsi="Calibri" w:cs="Calibri"/>
+                <w:color w:val="000000"/>
+                <w:sz w:val="18"/>
+                <w:szCs w:val="18"/>
+                <w:lang w:val="es-SV"/>
+              </w:rPr>
+            </w:r>
+            <w:r>
+              <w:rPr>
+                <w:rFonts w:ascii="Calibri" w:eastAsia="Calibri" w:hAnsi="Calibri" w:cs="Calibri"/>
+                <w:color w:val="000000"/>
+                <w:sz w:val="18"/>
+                <w:szCs w:val="18"/>
+                <w:lang w:val="es-SV"/>
+              </w:rPr>
+            </w:r>
+            <w:r>
+              <w:rPr>
+                <w:rFonts w:ascii="Calibri" w:eastAsia="Calibri" w:hAnsi="Calibri" w:cs="Calibri"/>
+                <w:color w:val="000000"/>
+                <w:sz w:val="18"/>
+                <w:szCs w:val="18"/>
+                <w:lang w:val="es-SV"/>
+              </w:rPr>
+            </w:r>
+            <w:r>
+              <w:rPr>
+                <w:rFonts w:ascii="Calibri" w:eastAsia="Calibri" w:hAnsi="Calibri" w:cs="Calibri"/>
+                <w:color w:val="000000"/>
+                <w:sz w:val="18"/>
+                <w:szCs w:val="18"/>
+                <w:lang w:val="es-SV"/>
+              </w:rPr>
+            </w:r>
+            <w:proofErr w:type="spellStart"/>
+            <w:r>
+              <w:rPr>
+                <w:rFonts w:ascii="Calibri" w:eastAsia="Calibri" w:hAnsi="Calibri" w:cs="Calibri"/>
+                <w:color w:val="000000"/>
+                <w:sz w:val="18"/>
+                <w:szCs w:val="18"/>
+                <w:lang w:val="es-SV"/>
+              </w:rPr>
+            </w:r>
+            <w:proofErr w:type="spellEnd"/>
+            <w:r>
+              <w:rPr>
+                <w:rFonts w:ascii="Calibri" w:eastAsia="Calibri" w:hAnsi="Calibri" w:cs="Calibri"/>
+                <w:color w:val="000000"/>
+                <w:sz w:val="18"/>
+                <w:szCs w:val="18"/>
+                <w:lang w:val="es-SV"/>
+              </w:rPr>
             </w:r>
           </w:p>
         </w:tc>
@@ -7023,49 +7017,45 @@
                 <w:szCs w:val="18"/>
                 <w:lang w:val="es-SV"/>
               </w:rPr>
-              <w:t xml:space="preserve">Formulario → </w:t>
-            </w:r>
-            <w:proofErr w:type="spellStart"/>
-            <w:r>
-              <w:rPr>
-                <w:rFonts w:ascii="Calibri" w:eastAsia="Calibri" w:hAnsi="Calibri" w:cs="Calibri"/>
-                <w:color w:val="000000"/>
-                <w:sz w:val="18"/>
-                <w:szCs w:val="18"/>
-                <w:lang w:val="es-SV"/>
-              </w:rPr>
-              <w:t>fetch</w:t>
-            </w:r>
-            <w:proofErr w:type="spellEnd"/>
-            <w:r>
-              <w:rPr>
-                <w:rFonts w:ascii="Calibri" w:eastAsia="Calibri" w:hAnsi="Calibri" w:cs="Calibri"/>
-                <w:color w:val="000000"/>
-                <w:sz w:val="18"/>
-                <w:szCs w:val="18"/>
-                <w:lang w:val="es-SV"/>
-              </w:rPr>
-              <w:t xml:space="preserve">() → POST /api/registro → </w:t>
-            </w:r>
-            <w:r>
-              <w:rPr>
-                <w:rFonts w:ascii="Calibri" w:eastAsia="Calibri" w:hAnsi="Calibri" w:cs="Calibri"/>
-                <w:color w:val="000000"/>
-                <w:sz w:val="18"/>
-                <w:szCs w:val="18"/>
-                <w:lang w:val="es-SV"/>
-              </w:rPr>
-              <w:t>transacción</w:t>
-            </w:r>
-            <w:r>
-              <w:rPr>
-                <w:rFonts w:ascii="Calibri" w:eastAsia="Calibri" w:hAnsi="Calibri" w:cs="Calibri"/>
-                <w:color w:val="000000"/>
-                <w:sz w:val="18"/>
-                <w:szCs w:val="18"/>
-                <w:lang w:val="es-SV"/>
-              </w:rPr>
-              <w:t xml:space="preserve"> ACID en PostgreSQL → UUID devuelto → QR generado con URL publica</w:t>
+              <w:t>Formulario → fetch() → POST /api/registro → transacción ACID en PostgreSQL → UUID devuelto → QR generado con URL pública. Pulseras adicionales: panel → POST /api/pulseras → transacción ACID → UUID + QR nuevos</w:t>
+            </w:r>
+            <w:proofErr w:type="spellStart"/>
+            <w:r>
+              <w:rPr>
+                <w:rFonts w:ascii="Calibri" w:eastAsia="Calibri" w:hAnsi="Calibri" w:cs="Calibri"/>
+                <w:color w:val="000000"/>
+                <w:sz w:val="18"/>
+                <w:szCs w:val="18"/>
+                <w:lang w:val="es-SV"/>
+              </w:rPr>
+            </w:r>
+            <w:proofErr w:type="spellEnd"/>
+            <w:r>
+              <w:rPr>
+                <w:rFonts w:ascii="Calibri" w:eastAsia="Calibri" w:hAnsi="Calibri" w:cs="Calibri"/>
+                <w:color w:val="000000"/>
+                <w:sz w:val="18"/>
+                <w:szCs w:val="18"/>
+                <w:lang w:val="es-SV"/>
+              </w:rPr>
+            </w:r>
+            <w:r>
+              <w:rPr>
+                <w:rFonts w:ascii="Calibri" w:eastAsia="Calibri" w:hAnsi="Calibri" w:cs="Calibri"/>
+                <w:color w:val="000000"/>
+                <w:sz w:val="18"/>
+                <w:szCs w:val="18"/>
+                <w:lang w:val="es-SV"/>
+              </w:rPr>
+            </w:r>
+            <w:r>
+              <w:rPr>
+                <w:rFonts w:ascii="Calibri" w:eastAsia="Calibri" w:hAnsi="Calibri" w:cs="Calibri"/>
+                <w:color w:val="000000"/>
+                <w:sz w:val="18"/>
+                <w:szCs w:val="18"/>
+                <w:lang w:val="es-SV"/>
+              </w:rPr>
             </w:r>
           </w:p>
         </w:tc>
@@ -11157,67 +11147,61 @@
                 <w:sz w:val="18"/>
                 <w:szCs w:val="18"/>
               </w:rPr>
-              <w:t xml:space="preserve">BEGIN → INSERT INTO </w:t>
-            </w:r>
-            <w:proofErr w:type="spellStart"/>
-            <w:r>
-              <w:rPr>
-                <w:rFonts w:ascii="Calibri" w:eastAsia="Calibri" w:hAnsi="Calibri" w:cs="Calibri"/>
-                <w:color w:val="000000"/>
-                <w:sz w:val="18"/>
-                <w:szCs w:val="18"/>
-              </w:rPr>
-              <w:t>pulseras</w:t>
-            </w:r>
-            <w:proofErr w:type="spellEnd"/>
-            <w:r>
-              <w:rPr>
-                <w:rFonts w:ascii="Calibri" w:eastAsia="Calibri" w:hAnsi="Calibri" w:cs="Calibri"/>
-                <w:color w:val="000000"/>
-                <w:sz w:val="18"/>
-                <w:szCs w:val="18"/>
-              </w:rPr>
-              <w:t xml:space="preserve"> → INSERT INTO </w:t>
-            </w:r>
-            <w:proofErr w:type="spellStart"/>
-            <w:r>
-              <w:rPr>
-                <w:rFonts w:ascii="Calibri" w:eastAsia="Calibri" w:hAnsi="Calibri" w:cs="Calibri"/>
-                <w:color w:val="000000"/>
-                <w:sz w:val="18"/>
-                <w:szCs w:val="18"/>
-              </w:rPr>
-              <w:t>perfiles</w:t>
-            </w:r>
-            <w:proofErr w:type="spellEnd"/>
-            <w:r>
-              <w:rPr>
-                <w:rFonts w:ascii="Calibri" w:eastAsia="Calibri" w:hAnsi="Calibri" w:cs="Calibri"/>
-                <w:color w:val="000000"/>
-                <w:sz w:val="18"/>
-                <w:szCs w:val="18"/>
-              </w:rPr>
-              <w:t xml:space="preserve"> → COMMIT (</w:t>
-            </w:r>
-            <w:proofErr w:type="spellStart"/>
-            <w:r>
-              <w:rPr>
-                <w:rFonts w:ascii="Calibri" w:eastAsia="Calibri" w:hAnsi="Calibri" w:cs="Calibri"/>
-                <w:color w:val="000000"/>
-                <w:sz w:val="18"/>
-                <w:szCs w:val="18"/>
-              </w:rPr>
-              <w:t>transaccion</w:t>
-            </w:r>
-            <w:proofErr w:type="spellEnd"/>
-            <w:r>
-              <w:rPr>
-                <w:rFonts w:ascii="Calibri" w:eastAsia="Calibri" w:hAnsi="Calibri" w:cs="Calibri"/>
-                <w:color w:val="000000"/>
-                <w:sz w:val="18"/>
-                <w:szCs w:val="18"/>
-              </w:rPr>
-              <w:t xml:space="preserve"> ACID)</w:t>
+              <w:t>POST /api/pulseras → BEGIN → INSERT INTO pulseras → INSERT INTO perfiles → INSERT INTO contactos_emergencia → COMMIT (transacción ACID)</w:t>
+            </w:r>
+            <w:proofErr w:type="spellStart"/>
+            <w:r>
+              <w:rPr>
+                <w:rFonts w:ascii="Calibri" w:eastAsia="Calibri" w:hAnsi="Calibri" w:cs="Calibri"/>
+                <w:color w:val="000000"/>
+                <w:sz w:val="18"/>
+                <w:szCs w:val="18"/>
+              </w:rPr>
+            </w:r>
+            <w:proofErr w:type="spellEnd"/>
+            <w:r>
+              <w:rPr>
+                <w:rFonts w:ascii="Calibri" w:eastAsia="Calibri" w:hAnsi="Calibri" w:cs="Calibri"/>
+                <w:color w:val="000000"/>
+                <w:sz w:val="18"/>
+                <w:szCs w:val="18"/>
+              </w:rPr>
+            </w:r>
+            <w:proofErr w:type="spellStart"/>
+            <w:r>
+              <w:rPr>
+                <w:rFonts w:ascii="Calibri" w:eastAsia="Calibri" w:hAnsi="Calibri" w:cs="Calibri"/>
+                <w:color w:val="000000"/>
+                <w:sz w:val="18"/>
+                <w:szCs w:val="18"/>
+              </w:rPr>
+            </w:r>
+            <w:proofErr w:type="spellEnd"/>
+            <w:r>
+              <w:rPr>
+                <w:rFonts w:ascii="Calibri" w:eastAsia="Calibri" w:hAnsi="Calibri" w:cs="Calibri"/>
+                <w:color w:val="000000"/>
+                <w:sz w:val="18"/>
+                <w:szCs w:val="18"/>
+              </w:rPr>
+            </w:r>
+            <w:proofErr w:type="spellStart"/>
+            <w:r>
+              <w:rPr>
+                <w:rFonts w:ascii="Calibri" w:eastAsia="Calibri" w:hAnsi="Calibri" w:cs="Calibri"/>
+                <w:color w:val="000000"/>
+                <w:sz w:val="18"/>
+                <w:szCs w:val="18"/>
+              </w:rPr>
+            </w:r>
+            <w:proofErr w:type="spellEnd"/>
+            <w:r>
+              <w:rPr>
+                <w:rFonts w:ascii="Calibri" w:eastAsia="Calibri" w:hAnsi="Calibri" w:cs="Calibri"/>
+                <w:color w:val="000000"/>
+                <w:sz w:val="18"/>
+                <w:szCs w:val="18"/>
+              </w:rPr>
             </w:r>
           </w:p>
         </w:tc>

</xml_diff>